<commit_message>
update longtime no see
</commit_message>
<xml_diff>
--- a/production_analysis/Rapport/Rapport de collecte_ICV_Février25.docx
+++ b/production_analysis/Rapport/Rapport de collecte_ICV_Février25.docx
@@ -1,6 +1,6 @@
 
 <file path=word/document.xml><?xml version="1.0" encoding="utf-8"?>
-<w:document xmlns:wpc="http://schemas.microsoft.com/office/word/2010/wordprocessingCanvas" xmlns:cx="http://schemas.microsoft.com/office/drawing/2014/chartex" xmlns:mc="http://schemas.openxmlformats.org/markup-compatibility/2006" xmlns:o="urn:schemas-microsoft-com:office:office" xmlns:r="http://schemas.openxmlformats.org/officeDocument/2006/relationships" xmlns:m="http://schemas.openxmlformats.org/officeDocument/2006/math" xmlns:v="urn:schemas-microsoft-com:vml" xmlns:wp14="http://schemas.microsoft.com/office/word/2010/wordprocessingDrawing" xmlns:wp="http://schemas.openxmlformats.org/drawingml/2006/wordprocessingDrawing" xmlns:w10="urn:schemas-microsoft-com:office:word" xmlns:w="http://schemas.openxmlformats.org/wordprocessingml/2006/main" xmlns:w14="http://schemas.microsoft.com/office/word/2010/wordml" xmlns:w15="http://schemas.microsoft.com/office/word/2012/wordml" xmlns:w16se="http://schemas.microsoft.com/office/word/2015/wordml/symex" xmlns:wpg="http://schemas.microsoft.com/office/word/2010/wordprocessingGroup" xmlns:wpi="http://schemas.microsoft.com/office/word/2010/wordprocessingInk" xmlns:wne="http://schemas.microsoft.com/office/word/2006/wordml" xmlns:wps="http://schemas.microsoft.com/office/word/2010/wordprocessingShape" mc:Ignorable="w14 w15 w16se wp14">
+<w:document xmlns:wpc="http://schemas.microsoft.com/office/word/2010/wordprocessingCanvas" xmlns:cx="http://schemas.microsoft.com/office/drawing/2014/chartex" xmlns:cx1="http://schemas.microsoft.com/office/drawing/2015/9/8/chartex" xmlns:cx2="http://schemas.microsoft.com/office/drawing/2015/10/21/chartex" xmlns:cx3="http://schemas.microsoft.com/office/drawing/2016/5/9/chartex" xmlns:cx4="http://schemas.microsoft.com/office/drawing/2016/5/10/chartex" xmlns:cx5="http://schemas.microsoft.com/office/drawing/2016/5/11/chartex" xmlns:cx6="http://schemas.microsoft.com/office/drawing/2016/5/12/chartex" xmlns:cx7="http://schemas.microsoft.com/office/drawing/2016/5/13/chartex" xmlns:cx8="http://schemas.microsoft.com/office/drawing/2016/5/14/chartex" xmlns:mc="http://schemas.openxmlformats.org/markup-compatibility/2006" xmlns:aink="http://schemas.microsoft.com/office/drawing/2016/ink" xmlns:am3d="http://schemas.microsoft.com/office/drawing/2017/model3d" xmlns:o="urn:schemas-microsoft-com:office:office" xmlns:oel="http://schemas.microsoft.com/office/2019/extlst" xmlns:r="http://schemas.openxmlformats.org/officeDocument/2006/relationships" xmlns:m="http://schemas.openxmlformats.org/officeDocument/2006/math" xmlns:v="urn:schemas-microsoft-com:vml" xmlns:wp14="http://schemas.microsoft.com/office/word/2010/wordprocessingDrawing" xmlns:wp="http://schemas.openxmlformats.org/drawingml/2006/wordprocessingDrawing" xmlns:w10="urn:schemas-microsoft-com:office:word" xmlns:w="http://schemas.openxmlformats.org/wordprocessingml/2006/main" xmlns:w14="http://schemas.microsoft.com/office/word/2010/wordml" xmlns:w15="http://schemas.microsoft.com/office/word/2012/wordml" xmlns:w16cex="http://schemas.microsoft.com/office/word/2018/wordml/cex" xmlns:w16cid="http://schemas.microsoft.com/office/word/2016/wordml/cid" xmlns:w16="http://schemas.microsoft.com/office/word/2018/wordml" xmlns:w16du="http://schemas.microsoft.com/office/word/2023/wordml/word16du" xmlns:w16sdtdh="http://schemas.microsoft.com/office/word/2020/wordml/sdtdatahash" xmlns:w16sdtfl="http://schemas.microsoft.com/office/word/2024/wordml/sdtformatlock" xmlns:w16se="http://schemas.microsoft.com/office/word/2015/wordml/symex" xmlns:wpg="http://schemas.microsoft.com/office/word/2010/wordprocessingGroup" xmlns:wpi="http://schemas.microsoft.com/office/word/2010/wordprocessingInk" xmlns:wne="http://schemas.microsoft.com/office/word/2006/wordml" xmlns:wps="http://schemas.microsoft.com/office/word/2010/wordprocessingShape" mc:Ignorable="w14 w15 w16se w16cid w16 w16cex w16sdtdh w16sdtfl w16du wp14">
   <w:body>
     <w:p>
       <w:pPr>
@@ -207,7 +207,29 @@
           <w:szCs w:val="24"/>
           <w:lang w:val="fr-FR"/>
         </w:rPr>
-        <w:t>Agence Nationale de la Statistique (ANStat)</w:t>
+        <w:t>Agence Nationale de la Statistique (</w:t>
+      </w:r>
+      <w:proofErr w:type="spellStart"/>
+      <w:r>
+        <w:rPr>
+          <w:rFonts w:ascii="Garamond" w:hAnsi="Garamond" w:cs="Segoe UI"/>
+          <w:b/>
+          <w:sz w:val="24"/>
+          <w:szCs w:val="24"/>
+          <w:lang w:val="fr-FR"/>
+        </w:rPr>
+        <w:t>ANStat</w:t>
+      </w:r>
+      <w:proofErr w:type="spellEnd"/>
+      <w:r>
+        <w:rPr>
+          <w:rFonts w:ascii="Garamond" w:hAnsi="Garamond" w:cs="Segoe UI"/>
+          <w:b/>
+          <w:sz w:val="24"/>
+          <w:szCs w:val="24"/>
+          <w:lang w:val="fr-FR"/>
+        </w:rPr>
+        <w:t>)</w:t>
       </w:r>
     </w:p>
     <w:p>
@@ -427,8 +449,6 @@
           <w:lang w:val="fr-FR"/>
         </w:rPr>
       </w:pPr>
-      <w:bookmarkStart w:id="1" w:name="_GoBack"/>
-      <w:bookmarkEnd w:id="1"/>
       <w:r>
         <w:rPr>
           <w:rFonts w:ascii="Garamond" w:hAnsi="Garamond"/>
@@ -1265,7 +1285,7 @@
                 <w:lang w:val="fr-FR"/>
               </w:rPr>
             </w:pPr>
-            <w:bookmarkStart w:id="2" w:name="_Ref183106180"/>
+            <w:bookmarkStart w:id="1" w:name="_Ref183106180"/>
           </w:p>
         </w:tc>
         <w:tc>
@@ -1300,24 +1320,10 @@
                 <w:sz w:val="24"/>
                 <w:szCs w:val="24"/>
               </w:rPr>
-              <w:t>Nombre d'interview</w:t>
-            </w:r>
-          </w:p>
-        </w:tc>
-        <w:tc>
-          <w:tcPr>
-            <w:tcW w:w="2043" w:type="dxa"/>
-            <w:tcBorders>
-              <w:top w:val="single" w:sz="8" w:space="0" w:color="auto"/>
-              <w:bottom w:val="single" w:sz="8" w:space="0" w:color="auto"/>
-            </w:tcBorders>
-            <w:shd w:val="clear" w:color="auto" w:fill="auto"/>
-            <w:hideMark/>
-          </w:tcPr>
-          <w:p>
-            <w:pPr>
-              <w:spacing w:after="0" w:line="240" w:lineRule="auto"/>
-              <w:jc w:val="center"/>
+              <w:t xml:space="preserve">Nombre </w:t>
+            </w:r>
+            <w:proofErr w:type="spellStart"/>
+            <w:r>
               <w:rPr>
                 <w:rFonts w:ascii="Garamond" w:eastAsia="Times New Roman" w:hAnsi="Garamond" w:cs="Calibri"/>
                 <w:b/>
@@ -1326,8 +1332,25 @@
                 <w:sz w:val="24"/>
                 <w:szCs w:val="24"/>
               </w:rPr>
-            </w:pPr>
-            <w:r>
+              <w:t>d'interview</w:t>
+            </w:r>
+            <w:proofErr w:type="spellEnd"/>
+          </w:p>
+        </w:tc>
+        <w:tc>
+          <w:tcPr>
+            <w:tcW w:w="2043" w:type="dxa"/>
+            <w:tcBorders>
+              <w:top w:val="single" w:sz="8" w:space="0" w:color="auto"/>
+              <w:bottom w:val="single" w:sz="8" w:space="0" w:color="auto"/>
+            </w:tcBorders>
+            <w:shd w:val="clear" w:color="auto" w:fill="auto"/>
+            <w:hideMark/>
+          </w:tcPr>
+          <w:p>
+            <w:pPr>
+              <w:spacing w:after="0" w:line="240" w:lineRule="auto"/>
+              <w:jc w:val="center"/>
               <w:rPr>
                 <w:rFonts w:ascii="Garamond" w:eastAsia="Times New Roman" w:hAnsi="Garamond" w:cs="Calibri"/>
                 <w:b/>
@@ -1336,24 +1359,8 @@
                 <w:sz w:val="24"/>
                 <w:szCs w:val="24"/>
               </w:rPr>
-              <w:t>Interview terminés</w:t>
-            </w:r>
-          </w:p>
-        </w:tc>
-        <w:tc>
-          <w:tcPr>
-            <w:tcW w:w="1285" w:type="dxa"/>
-            <w:tcBorders>
-              <w:top w:val="single" w:sz="8" w:space="0" w:color="auto"/>
-              <w:bottom w:val="single" w:sz="8" w:space="0" w:color="auto"/>
-            </w:tcBorders>
-            <w:shd w:val="clear" w:color="auto" w:fill="auto"/>
-            <w:hideMark/>
-          </w:tcPr>
-          <w:p>
-            <w:pPr>
-              <w:spacing w:after="0" w:line="240" w:lineRule="auto"/>
-              <w:jc w:val="center"/>
+            </w:pPr>
+            <w:r>
               <w:rPr>
                 <w:rFonts w:ascii="Garamond" w:eastAsia="Times New Roman" w:hAnsi="Garamond" w:cs="Calibri"/>
                 <w:b/>
@@ -1362,7 +1369,9 @@
                 <w:sz w:val="24"/>
                 <w:szCs w:val="24"/>
               </w:rPr>
-            </w:pPr>
+              <w:t xml:space="preserve">Interview </w:t>
+            </w:r>
+            <w:proofErr w:type="spellStart"/>
             <w:r>
               <w:rPr>
                 <w:rFonts w:ascii="Garamond" w:eastAsia="Times New Roman" w:hAnsi="Garamond" w:cs="Calibri"/>
@@ -1372,17 +1381,17 @@
                 <w:sz w:val="24"/>
                 <w:szCs w:val="24"/>
               </w:rPr>
-              <w:t>Refus</w:t>
-            </w:r>
-          </w:p>
-        </w:tc>
-        <w:tc>
-          <w:tcPr>
-            <w:tcW w:w="1703" w:type="dxa"/>
+              <w:t>terminés</w:t>
+            </w:r>
+            <w:proofErr w:type="spellEnd"/>
+          </w:p>
+        </w:tc>
+        <w:tc>
+          <w:tcPr>
+            <w:tcW w:w="1285" w:type="dxa"/>
             <w:tcBorders>
               <w:top w:val="single" w:sz="8" w:space="0" w:color="auto"/>
               <w:bottom w:val="single" w:sz="8" w:space="0" w:color="auto"/>
-              <w:right w:val="single" w:sz="8" w:space="0" w:color="auto"/>
             </w:tcBorders>
             <w:shd w:val="clear" w:color="auto" w:fill="auto"/>
             <w:hideMark/>
@@ -1400,6 +1409,7 @@
                 <w:szCs w:val="24"/>
               </w:rPr>
             </w:pPr>
+            <w:proofErr w:type="spellStart"/>
             <w:r>
               <w:rPr>
                 <w:rFonts w:ascii="Garamond" w:eastAsia="Times New Roman" w:hAnsi="Garamond" w:cs="Calibri"/>
@@ -1409,8 +1419,48 @@
                 <w:sz w:val="24"/>
                 <w:szCs w:val="24"/>
               </w:rPr>
+              <w:t>Refus</w:t>
+            </w:r>
+            <w:proofErr w:type="spellEnd"/>
+          </w:p>
+        </w:tc>
+        <w:tc>
+          <w:tcPr>
+            <w:tcW w:w="1703" w:type="dxa"/>
+            <w:tcBorders>
+              <w:top w:val="single" w:sz="8" w:space="0" w:color="auto"/>
+              <w:bottom w:val="single" w:sz="8" w:space="0" w:color="auto"/>
+              <w:right w:val="single" w:sz="8" w:space="0" w:color="auto"/>
+            </w:tcBorders>
+            <w:shd w:val="clear" w:color="auto" w:fill="auto"/>
+            <w:hideMark/>
+          </w:tcPr>
+          <w:p>
+            <w:pPr>
+              <w:spacing w:after="0" w:line="240" w:lineRule="auto"/>
+              <w:jc w:val="center"/>
+              <w:rPr>
+                <w:rFonts w:ascii="Garamond" w:eastAsia="Times New Roman" w:hAnsi="Garamond" w:cs="Calibri"/>
+                <w:b/>
+                <w:bCs/>
+                <w:color w:val="000000"/>
+                <w:sz w:val="24"/>
+                <w:szCs w:val="24"/>
+              </w:rPr>
+            </w:pPr>
+            <w:proofErr w:type="spellStart"/>
+            <w:r>
+              <w:rPr>
+                <w:rFonts w:ascii="Garamond" w:eastAsia="Times New Roman" w:hAnsi="Garamond" w:cs="Calibri"/>
+                <w:b/>
+                <w:bCs/>
+                <w:color w:val="000000"/>
+                <w:sz w:val="24"/>
+                <w:szCs w:val="24"/>
+              </w:rPr>
               <w:t>Injoignables</w:t>
             </w:r>
+            <w:proofErr w:type="spellEnd"/>
           </w:p>
         </w:tc>
       </w:tr>
@@ -1443,6 +1493,7 @@
                 <w:szCs w:val="24"/>
               </w:rPr>
             </w:pPr>
+            <w:proofErr w:type="spellStart"/>
             <w:r>
               <w:rPr>
                 <w:rFonts w:ascii="Garamond" w:eastAsia="Times New Roman" w:hAnsi="Garamond" w:cs="Calibri"/>
@@ -1454,6 +1505,7 @@
               </w:rPr>
               <w:t>Effectif</w:t>
             </w:r>
+            <w:proofErr w:type="spellEnd"/>
           </w:p>
         </w:tc>
         <w:tc>
@@ -1850,7 +1902,7 @@
         </w:rPr>
         <w:fldChar w:fldCharType="end"/>
       </w:r>
-      <w:bookmarkEnd w:id="2"/>
+      <w:bookmarkEnd w:id="1"/>
       <w:r>
         <w:rPr>
           <w:rFonts w:ascii="Book Antiqua" w:hAnsi="Book Antiqua"/>
@@ -2116,6 +2168,9 @@
         <w:spacing w:line="360" w:lineRule="auto"/>
         <w:jc w:val="both"/>
         <w:rPr>
+          <w:rFonts w:ascii="Garamond" w:hAnsi="Garamond"/>
+          <w:sz w:val="24"/>
+          <w:szCs w:val="24"/>
           <w:lang w:val="fr-FR"/>
         </w:rPr>
       </w:pPr>
@@ -2344,6 +2399,7 @@
                 <w:szCs w:val="24"/>
               </w:rPr>
             </w:pPr>
+            <w:proofErr w:type="spellStart"/>
             <w:r>
               <w:rPr>
                 <w:rFonts w:ascii="Garamond" w:eastAsia="Times New Roman" w:hAnsi="Garamond" w:cs="Calibri"/>
@@ -2354,6 +2410,7 @@
               </w:rPr>
               <w:t>Effectif</w:t>
             </w:r>
+            <w:proofErr w:type="spellEnd"/>
           </w:p>
         </w:tc>
         <w:tc>
@@ -2381,6 +2438,7 @@
                 <w:szCs w:val="24"/>
               </w:rPr>
             </w:pPr>
+            <w:proofErr w:type="spellStart"/>
             <w:r>
               <w:rPr>
                 <w:rFonts w:ascii="Garamond" w:eastAsia="Times New Roman" w:hAnsi="Garamond" w:cs="Calibri"/>
@@ -2391,6 +2449,7 @@
               </w:rPr>
               <w:t>pourcentage</w:t>
             </w:r>
+            <w:proofErr w:type="spellEnd"/>
           </w:p>
         </w:tc>
       </w:tr>
@@ -3504,8 +3563,8 @@
           <w:lang w:val="fr-FR"/>
         </w:rPr>
       </w:pPr>
-      <w:bookmarkStart w:id="3" w:name="_Ref183708354"/>
-      <w:bookmarkStart w:id="4" w:name="_Ref183708349"/>
+      <w:bookmarkStart w:id="2" w:name="_Ref183708354"/>
+      <w:bookmarkStart w:id="3" w:name="_Ref183708349"/>
     </w:p>
     <w:p>
       <w:pPr>
@@ -3586,16 +3645,16 @@
         </w:rPr>
         <w:fldChar w:fldCharType="end"/>
       </w:r>
+      <w:bookmarkEnd w:id="2"/>
+      <w:r>
+        <w:rPr>
+          <w:rFonts w:ascii="Book Antiqua" w:hAnsi="Book Antiqua"/>
+          <w:sz w:val="24"/>
+          <w:lang w:val="fr-FR"/>
+        </w:rPr>
+        <w:t>: Soldes d'opinion nationaux</w:t>
+      </w:r>
       <w:bookmarkEnd w:id="3"/>
-      <w:r>
-        <w:rPr>
-          <w:rFonts w:ascii="Book Antiqua" w:hAnsi="Book Antiqua"/>
-          <w:sz w:val="24"/>
-          <w:lang w:val="fr-FR"/>
-        </w:rPr>
-        <w:t>: Soldes d'opinion nationaux</w:t>
-      </w:r>
-      <w:bookmarkEnd w:id="4"/>
     </w:p>
     <w:tbl>
       <w:tblPr>
@@ -3639,6 +3698,7 @@
                 <w:szCs w:val="24"/>
               </w:rPr>
             </w:pPr>
+            <w:proofErr w:type="spellStart"/>
             <w:r>
               <w:rPr>
                 <w:rFonts w:ascii="Times New Roman" w:eastAsia="Times New Roman" w:hAnsi="Times New Roman" w:cs="Times New Roman"/>
@@ -3650,6 +3710,7 @@
               </w:rPr>
               <w:t>Soldes</w:t>
             </w:r>
+            <w:proofErr w:type="spellEnd"/>
           </w:p>
         </w:tc>
         <w:tc>
@@ -3757,6 +3818,7 @@
                 <w:szCs w:val="24"/>
               </w:rPr>
             </w:pPr>
+            <w:proofErr w:type="spellStart"/>
             <w:r>
               <w:rPr>
                 <w:rFonts w:ascii="Times New Roman" w:eastAsia="Times New Roman" w:hAnsi="Times New Roman" w:cs="Times New Roman"/>
@@ -3766,8 +3828,33 @@
                 <w:sz w:val="24"/>
                 <w:szCs w:val="24"/>
               </w:rPr>
-              <w:t>Intervalle de confiance</w:t>
-            </w:r>
+              <w:t>Intervalle</w:t>
+            </w:r>
+            <w:proofErr w:type="spellEnd"/>
+            <w:r>
+              <w:rPr>
+                <w:rFonts w:ascii="Times New Roman" w:eastAsia="Times New Roman" w:hAnsi="Times New Roman" w:cs="Times New Roman"/>
+                <w:b/>
+                <w:bCs/>
+                <w:color w:val="000000"/>
+                <w:sz w:val="24"/>
+                <w:szCs w:val="24"/>
+              </w:rPr>
+              <w:t xml:space="preserve"> de </w:t>
+            </w:r>
+            <w:proofErr w:type="spellStart"/>
+            <w:r>
+              <w:rPr>
+                <w:rFonts w:ascii="Times New Roman" w:eastAsia="Times New Roman" w:hAnsi="Times New Roman" w:cs="Times New Roman"/>
+                <w:b/>
+                <w:bCs/>
+                <w:color w:val="000000"/>
+                <w:sz w:val="24"/>
+                <w:szCs w:val="24"/>
+              </w:rPr>
+              <w:t>confiance</w:t>
+            </w:r>
+            <w:proofErr w:type="spellEnd"/>
           </w:p>
         </w:tc>
       </w:tr>
@@ -3798,14 +3885,25 @@
                 <w:szCs w:val="24"/>
               </w:rPr>
             </w:pPr>
-            <w:r>
-              <w:rPr>
-                <w:rFonts w:ascii="Times New Roman" w:eastAsia="Times New Roman" w:hAnsi="Times New Roman" w:cs="Times New Roman"/>
-                <w:color w:val="000000"/>
-                <w:sz w:val="24"/>
-                <w:szCs w:val="24"/>
-              </w:rPr>
-              <w:t>Solde situation financière</w:t>
+            <w:proofErr w:type="spellStart"/>
+            <w:r>
+              <w:rPr>
+                <w:rFonts w:ascii="Times New Roman" w:eastAsia="Times New Roman" w:hAnsi="Times New Roman" w:cs="Times New Roman"/>
+                <w:color w:val="000000"/>
+                <w:sz w:val="24"/>
+                <w:szCs w:val="24"/>
+              </w:rPr>
+              <w:t>Solde</w:t>
+            </w:r>
+            <w:proofErr w:type="spellEnd"/>
+            <w:r>
+              <w:rPr>
+                <w:rFonts w:ascii="Times New Roman" w:eastAsia="Times New Roman" w:hAnsi="Times New Roman" w:cs="Times New Roman"/>
+                <w:color w:val="000000"/>
+                <w:sz w:val="24"/>
+                <w:szCs w:val="24"/>
+              </w:rPr>
+              <w:t xml:space="preserve"> situation financière</w:t>
             </w:r>
           </w:p>
         </w:tc>
@@ -3977,14 +4075,25 @@
                 <w:szCs w:val="24"/>
               </w:rPr>
             </w:pPr>
-            <w:r>
-              <w:rPr>
-                <w:rFonts w:ascii="Times New Roman" w:eastAsia="Times New Roman" w:hAnsi="Times New Roman" w:cs="Times New Roman"/>
-                <w:color w:val="000000"/>
-                <w:sz w:val="24"/>
-                <w:szCs w:val="24"/>
-              </w:rPr>
-              <w:t>Solde situation financière (Banque)</w:t>
+            <w:proofErr w:type="spellStart"/>
+            <w:r>
+              <w:rPr>
+                <w:rFonts w:ascii="Times New Roman" w:eastAsia="Times New Roman" w:hAnsi="Times New Roman" w:cs="Times New Roman"/>
+                <w:color w:val="000000"/>
+                <w:sz w:val="24"/>
+                <w:szCs w:val="24"/>
+              </w:rPr>
+              <w:t>Solde</w:t>
+            </w:r>
+            <w:proofErr w:type="spellEnd"/>
+            <w:r>
+              <w:rPr>
+                <w:rFonts w:ascii="Times New Roman" w:eastAsia="Times New Roman" w:hAnsi="Times New Roman" w:cs="Times New Roman"/>
+                <w:color w:val="000000"/>
+                <w:sz w:val="24"/>
+                <w:szCs w:val="24"/>
+              </w:rPr>
+              <w:t xml:space="preserve"> situation financière (Banque)</w:t>
             </w:r>
           </w:p>
         </w:tc>
@@ -4163,7 +4272,47 @@
                 <w:sz w:val="24"/>
                 <w:szCs w:val="24"/>
               </w:rPr>
-              <w:t>Situation économique globale (Banque)</w:t>
+              <w:t xml:space="preserve">Situation </w:t>
+            </w:r>
+            <w:proofErr w:type="spellStart"/>
+            <w:r>
+              <w:rPr>
+                <w:rFonts w:ascii="Times New Roman" w:eastAsia="Times New Roman" w:hAnsi="Times New Roman" w:cs="Times New Roman"/>
+                <w:color w:val="000000"/>
+                <w:sz w:val="24"/>
+                <w:szCs w:val="24"/>
+              </w:rPr>
+              <w:t>économique</w:t>
+            </w:r>
+            <w:proofErr w:type="spellEnd"/>
+            <w:r>
+              <w:rPr>
+                <w:rFonts w:ascii="Times New Roman" w:eastAsia="Times New Roman" w:hAnsi="Times New Roman" w:cs="Times New Roman"/>
+                <w:color w:val="000000"/>
+                <w:sz w:val="24"/>
+                <w:szCs w:val="24"/>
+              </w:rPr>
+              <w:t xml:space="preserve"> </w:t>
+            </w:r>
+            <w:proofErr w:type="spellStart"/>
+            <w:r>
+              <w:rPr>
+                <w:rFonts w:ascii="Times New Roman" w:eastAsia="Times New Roman" w:hAnsi="Times New Roman" w:cs="Times New Roman"/>
+                <w:color w:val="000000"/>
+                <w:sz w:val="24"/>
+                <w:szCs w:val="24"/>
+              </w:rPr>
+              <w:t>globale</w:t>
+            </w:r>
+            <w:proofErr w:type="spellEnd"/>
+            <w:r>
+              <w:rPr>
+                <w:rFonts w:ascii="Times New Roman" w:eastAsia="Times New Roman" w:hAnsi="Times New Roman" w:cs="Times New Roman"/>
+                <w:color w:val="000000"/>
+                <w:sz w:val="24"/>
+                <w:szCs w:val="24"/>
+              </w:rPr>
+              <w:t xml:space="preserve"> (Banque)</w:t>
             </w:r>
           </w:p>
         </w:tc>
@@ -4342,8 +4491,39 @@
                 <w:sz w:val="24"/>
                 <w:szCs w:val="24"/>
               </w:rPr>
-              <w:t>Situation économique globale</w:t>
-            </w:r>
+              <w:t xml:space="preserve">Situation </w:t>
+            </w:r>
+            <w:proofErr w:type="spellStart"/>
+            <w:r>
+              <w:rPr>
+                <w:rFonts w:ascii="Times New Roman" w:eastAsia="Times New Roman" w:hAnsi="Times New Roman" w:cs="Times New Roman"/>
+                <w:color w:val="000000"/>
+                <w:sz w:val="24"/>
+                <w:szCs w:val="24"/>
+              </w:rPr>
+              <w:t>économique</w:t>
+            </w:r>
+            <w:proofErr w:type="spellEnd"/>
+            <w:r>
+              <w:rPr>
+                <w:rFonts w:ascii="Times New Roman" w:eastAsia="Times New Roman" w:hAnsi="Times New Roman" w:cs="Times New Roman"/>
+                <w:color w:val="000000"/>
+                <w:sz w:val="24"/>
+                <w:szCs w:val="24"/>
+              </w:rPr>
+              <w:t xml:space="preserve"> </w:t>
+            </w:r>
+            <w:proofErr w:type="spellStart"/>
+            <w:r>
+              <w:rPr>
+                <w:rFonts w:ascii="Times New Roman" w:eastAsia="Times New Roman" w:hAnsi="Times New Roman" w:cs="Times New Roman"/>
+                <w:color w:val="000000"/>
+                <w:sz w:val="24"/>
+                <w:szCs w:val="24"/>
+              </w:rPr>
+              <w:t>globale</w:t>
+            </w:r>
+            <w:proofErr w:type="spellEnd"/>
           </w:p>
         </w:tc>
         <w:tc>
@@ -4876,14 +5056,45 @@
                 <w:szCs w:val="24"/>
               </w:rPr>
             </w:pPr>
-            <w:r>
-              <w:rPr>
-                <w:rFonts w:ascii="Times New Roman" w:eastAsia="Times New Roman" w:hAnsi="Times New Roman" w:cs="Times New Roman"/>
-                <w:color w:val="000000"/>
-                <w:sz w:val="24"/>
-                <w:szCs w:val="24"/>
-              </w:rPr>
-              <w:t>Solde revenu (Banque)</w:t>
+            <w:proofErr w:type="spellStart"/>
+            <w:r>
+              <w:rPr>
+                <w:rFonts w:ascii="Times New Roman" w:eastAsia="Times New Roman" w:hAnsi="Times New Roman" w:cs="Times New Roman"/>
+                <w:color w:val="000000"/>
+                <w:sz w:val="24"/>
+                <w:szCs w:val="24"/>
+              </w:rPr>
+              <w:t>Solde</w:t>
+            </w:r>
+            <w:proofErr w:type="spellEnd"/>
+            <w:r>
+              <w:rPr>
+                <w:rFonts w:ascii="Times New Roman" w:eastAsia="Times New Roman" w:hAnsi="Times New Roman" w:cs="Times New Roman"/>
+                <w:color w:val="000000"/>
+                <w:sz w:val="24"/>
+                <w:szCs w:val="24"/>
+              </w:rPr>
+              <w:t xml:space="preserve"> </w:t>
+            </w:r>
+            <w:proofErr w:type="spellStart"/>
+            <w:r>
+              <w:rPr>
+                <w:rFonts w:ascii="Times New Roman" w:eastAsia="Times New Roman" w:hAnsi="Times New Roman" w:cs="Times New Roman"/>
+                <w:color w:val="000000"/>
+                <w:sz w:val="24"/>
+                <w:szCs w:val="24"/>
+              </w:rPr>
+              <w:t>revenu</w:t>
+            </w:r>
+            <w:proofErr w:type="spellEnd"/>
+            <w:r>
+              <w:rPr>
+                <w:rFonts w:ascii="Times New Roman" w:eastAsia="Times New Roman" w:hAnsi="Times New Roman" w:cs="Times New Roman"/>
+                <w:color w:val="000000"/>
+                <w:sz w:val="24"/>
+                <w:szCs w:val="24"/>
+              </w:rPr>
+              <w:t xml:space="preserve"> (Banque)</w:t>
             </w:r>
           </w:p>
         </w:tc>
@@ -5055,15 +5266,37 @@
                 <w:szCs w:val="24"/>
               </w:rPr>
             </w:pPr>
-            <w:r>
-              <w:rPr>
-                <w:rFonts w:ascii="Times New Roman" w:eastAsia="Times New Roman" w:hAnsi="Times New Roman" w:cs="Times New Roman"/>
-                <w:color w:val="000000"/>
-                <w:sz w:val="24"/>
-                <w:szCs w:val="24"/>
-              </w:rPr>
-              <w:t>Solde revenu</w:t>
-            </w:r>
+            <w:proofErr w:type="spellStart"/>
+            <w:r>
+              <w:rPr>
+                <w:rFonts w:ascii="Times New Roman" w:eastAsia="Times New Roman" w:hAnsi="Times New Roman" w:cs="Times New Roman"/>
+                <w:color w:val="000000"/>
+                <w:sz w:val="24"/>
+                <w:szCs w:val="24"/>
+              </w:rPr>
+              <w:t>Solde</w:t>
+            </w:r>
+            <w:proofErr w:type="spellEnd"/>
+            <w:r>
+              <w:rPr>
+                <w:rFonts w:ascii="Times New Roman" w:eastAsia="Times New Roman" w:hAnsi="Times New Roman" w:cs="Times New Roman"/>
+                <w:color w:val="000000"/>
+                <w:sz w:val="24"/>
+                <w:szCs w:val="24"/>
+              </w:rPr>
+              <w:t xml:space="preserve"> </w:t>
+            </w:r>
+            <w:proofErr w:type="spellStart"/>
+            <w:r>
+              <w:rPr>
+                <w:rFonts w:ascii="Times New Roman" w:eastAsia="Times New Roman" w:hAnsi="Times New Roman" w:cs="Times New Roman"/>
+                <w:color w:val="000000"/>
+                <w:sz w:val="24"/>
+                <w:szCs w:val="24"/>
+              </w:rPr>
+              <w:t>revenu</w:t>
+            </w:r>
+            <w:proofErr w:type="spellEnd"/>
           </w:p>
         </w:tc>
         <w:tc>
@@ -5243,7 +5476,29 @@
                 <w:szCs w:val="24"/>
                 <w:lang w:val="fr-FR"/>
               </w:rPr>
-              <w:t>Solde de cherte de la vie (banque)</w:t>
+              <w:t xml:space="preserve">Solde de </w:t>
+            </w:r>
+            <w:proofErr w:type="spellStart"/>
+            <w:r>
+              <w:rPr>
+                <w:rFonts w:ascii="Times New Roman" w:eastAsia="Times New Roman" w:hAnsi="Times New Roman" w:cs="Times New Roman"/>
+                <w:color w:val="000000"/>
+                <w:sz w:val="24"/>
+                <w:szCs w:val="24"/>
+                <w:lang w:val="fr-FR"/>
+              </w:rPr>
+              <w:t>cherte</w:t>
+            </w:r>
+            <w:proofErr w:type="spellEnd"/>
+            <w:r>
+              <w:rPr>
+                <w:rFonts w:ascii="Times New Roman" w:eastAsia="Times New Roman" w:hAnsi="Times New Roman" w:cs="Times New Roman"/>
+                <w:color w:val="000000"/>
+                <w:sz w:val="24"/>
+                <w:szCs w:val="24"/>
+                <w:lang w:val="fr-FR"/>
+              </w:rPr>
+              <w:t xml:space="preserve"> de la vie (banque)</w:t>
             </w:r>
           </w:p>
         </w:tc>
@@ -5424,7 +5679,29 @@
                 <w:szCs w:val="24"/>
                 <w:lang w:val="fr-FR"/>
               </w:rPr>
-              <w:t>Solde de cherte de la vie</w:t>
+              <w:t xml:space="preserve">Solde de </w:t>
+            </w:r>
+            <w:proofErr w:type="spellStart"/>
+            <w:r>
+              <w:rPr>
+                <w:rFonts w:ascii="Times New Roman" w:eastAsia="Times New Roman" w:hAnsi="Times New Roman" w:cs="Times New Roman"/>
+                <w:color w:val="000000"/>
+                <w:sz w:val="24"/>
+                <w:szCs w:val="24"/>
+                <w:lang w:val="fr-FR"/>
+              </w:rPr>
+              <w:t>cherte</w:t>
+            </w:r>
+            <w:proofErr w:type="spellEnd"/>
+            <w:r>
+              <w:rPr>
+                <w:rFonts w:ascii="Times New Roman" w:eastAsia="Times New Roman" w:hAnsi="Times New Roman" w:cs="Times New Roman"/>
+                <w:color w:val="000000"/>
+                <w:sz w:val="24"/>
+                <w:szCs w:val="24"/>
+                <w:lang w:val="fr-FR"/>
+              </w:rPr>
+              <w:t xml:space="preserve"> de la vie</w:t>
             </w:r>
           </w:p>
         </w:tc>
@@ -5596,14 +5873,45 @@
                 <w:szCs w:val="24"/>
               </w:rPr>
             </w:pPr>
-            <w:r>
-              <w:rPr>
-                <w:rFonts w:ascii="Times New Roman" w:eastAsia="Times New Roman" w:hAnsi="Times New Roman" w:cs="Times New Roman"/>
-                <w:color w:val="000000"/>
-                <w:sz w:val="24"/>
-                <w:szCs w:val="24"/>
-              </w:rPr>
-              <w:t>Solde des dépenses (Banque)</w:t>
+            <w:proofErr w:type="spellStart"/>
+            <w:r>
+              <w:rPr>
+                <w:rFonts w:ascii="Times New Roman" w:eastAsia="Times New Roman" w:hAnsi="Times New Roman" w:cs="Times New Roman"/>
+                <w:color w:val="000000"/>
+                <w:sz w:val="24"/>
+                <w:szCs w:val="24"/>
+              </w:rPr>
+              <w:t>Solde</w:t>
+            </w:r>
+            <w:proofErr w:type="spellEnd"/>
+            <w:r>
+              <w:rPr>
+                <w:rFonts w:ascii="Times New Roman" w:eastAsia="Times New Roman" w:hAnsi="Times New Roman" w:cs="Times New Roman"/>
+                <w:color w:val="000000"/>
+                <w:sz w:val="24"/>
+                <w:szCs w:val="24"/>
+              </w:rPr>
+              <w:t xml:space="preserve"> des </w:t>
+            </w:r>
+            <w:proofErr w:type="spellStart"/>
+            <w:r>
+              <w:rPr>
+                <w:rFonts w:ascii="Times New Roman" w:eastAsia="Times New Roman" w:hAnsi="Times New Roman" w:cs="Times New Roman"/>
+                <w:color w:val="000000"/>
+                <w:sz w:val="24"/>
+                <w:szCs w:val="24"/>
+              </w:rPr>
+              <w:t>dépenses</w:t>
+            </w:r>
+            <w:proofErr w:type="spellEnd"/>
+            <w:r>
+              <w:rPr>
+                <w:rFonts w:ascii="Times New Roman" w:eastAsia="Times New Roman" w:hAnsi="Times New Roman" w:cs="Times New Roman"/>
+                <w:color w:val="000000"/>
+                <w:sz w:val="24"/>
+                <w:szCs w:val="24"/>
+              </w:rPr>
+              <w:t xml:space="preserve"> (Banque)</w:t>
             </w:r>
           </w:p>
         </w:tc>
@@ -5775,15 +6083,37 @@
                 <w:szCs w:val="24"/>
               </w:rPr>
             </w:pPr>
-            <w:r>
-              <w:rPr>
-                <w:rFonts w:ascii="Times New Roman" w:eastAsia="Times New Roman" w:hAnsi="Times New Roman" w:cs="Times New Roman"/>
-                <w:color w:val="000000"/>
-                <w:sz w:val="24"/>
-                <w:szCs w:val="24"/>
-              </w:rPr>
-              <w:t>Solde des dépenses</w:t>
-            </w:r>
+            <w:proofErr w:type="spellStart"/>
+            <w:r>
+              <w:rPr>
+                <w:rFonts w:ascii="Times New Roman" w:eastAsia="Times New Roman" w:hAnsi="Times New Roman" w:cs="Times New Roman"/>
+                <w:color w:val="000000"/>
+                <w:sz w:val="24"/>
+                <w:szCs w:val="24"/>
+              </w:rPr>
+              <w:t>Solde</w:t>
+            </w:r>
+            <w:proofErr w:type="spellEnd"/>
+            <w:r>
+              <w:rPr>
+                <w:rFonts w:ascii="Times New Roman" w:eastAsia="Times New Roman" w:hAnsi="Times New Roman" w:cs="Times New Roman"/>
+                <w:color w:val="000000"/>
+                <w:sz w:val="24"/>
+                <w:szCs w:val="24"/>
+              </w:rPr>
+              <w:t xml:space="preserve"> des </w:t>
+            </w:r>
+            <w:proofErr w:type="spellStart"/>
+            <w:r>
+              <w:rPr>
+                <w:rFonts w:ascii="Times New Roman" w:eastAsia="Times New Roman" w:hAnsi="Times New Roman" w:cs="Times New Roman"/>
+                <w:color w:val="000000"/>
+                <w:sz w:val="24"/>
+                <w:szCs w:val="24"/>
+              </w:rPr>
+              <w:t>dépenses</w:t>
+            </w:r>
+            <w:proofErr w:type="spellEnd"/>
           </w:p>
         </w:tc>
         <w:tc>
@@ -6135,14 +6465,45 @@
                 <w:szCs w:val="24"/>
               </w:rPr>
             </w:pPr>
-            <w:r>
-              <w:rPr>
-                <w:rFonts w:ascii="Times New Roman" w:eastAsia="Times New Roman" w:hAnsi="Times New Roman" w:cs="Times New Roman"/>
-                <w:color w:val="000000"/>
-                <w:sz w:val="24"/>
-                <w:szCs w:val="24"/>
-              </w:rPr>
-              <w:t>Solde évolution des prix</w:t>
+            <w:proofErr w:type="spellStart"/>
+            <w:r>
+              <w:rPr>
+                <w:rFonts w:ascii="Times New Roman" w:eastAsia="Times New Roman" w:hAnsi="Times New Roman" w:cs="Times New Roman"/>
+                <w:color w:val="000000"/>
+                <w:sz w:val="24"/>
+                <w:szCs w:val="24"/>
+              </w:rPr>
+              <w:t>Solde</w:t>
+            </w:r>
+            <w:proofErr w:type="spellEnd"/>
+            <w:r>
+              <w:rPr>
+                <w:rFonts w:ascii="Times New Roman" w:eastAsia="Times New Roman" w:hAnsi="Times New Roman" w:cs="Times New Roman"/>
+                <w:color w:val="000000"/>
+                <w:sz w:val="24"/>
+                <w:szCs w:val="24"/>
+              </w:rPr>
+              <w:t xml:space="preserve"> </w:t>
+            </w:r>
+            <w:proofErr w:type="spellStart"/>
+            <w:r>
+              <w:rPr>
+                <w:rFonts w:ascii="Times New Roman" w:eastAsia="Times New Roman" w:hAnsi="Times New Roman" w:cs="Times New Roman"/>
+                <w:color w:val="000000"/>
+                <w:sz w:val="24"/>
+                <w:szCs w:val="24"/>
+              </w:rPr>
+              <w:t>évolution</w:t>
+            </w:r>
+            <w:proofErr w:type="spellEnd"/>
+            <w:r>
+              <w:rPr>
+                <w:rFonts w:ascii="Times New Roman" w:eastAsia="Times New Roman" w:hAnsi="Times New Roman" w:cs="Times New Roman"/>
+                <w:color w:val="000000"/>
+                <w:sz w:val="24"/>
+                <w:szCs w:val="24"/>
+              </w:rPr>
+              <w:t xml:space="preserve"> des prix</w:t>
             </w:r>
           </w:p>
         </w:tc>
@@ -7264,6 +7625,7 @@
                 <w:szCs w:val="24"/>
               </w:rPr>
             </w:pPr>
+            <w:proofErr w:type="spellStart"/>
             <w:r>
               <w:rPr>
                 <w:rFonts w:ascii="Garamond" w:eastAsia="Times New Roman" w:hAnsi="Garamond" w:cs="Calibri"/>
@@ -7272,6 +7634,7 @@
               </w:rPr>
               <w:t>Effectif</w:t>
             </w:r>
+            <w:proofErr w:type="spellEnd"/>
           </w:p>
         </w:tc>
         <w:tc>
@@ -7297,6 +7660,7 @@
                 <w:szCs w:val="24"/>
               </w:rPr>
             </w:pPr>
+            <w:proofErr w:type="spellStart"/>
             <w:r>
               <w:rPr>
                 <w:rFonts w:ascii="Garamond" w:eastAsia="Times New Roman" w:hAnsi="Garamond" w:cs="Calibri"/>
@@ -7305,6 +7669,7 @@
               </w:rPr>
               <w:t>Pourcentage</w:t>
             </w:r>
+            <w:proofErr w:type="spellEnd"/>
           </w:p>
         </w:tc>
       </w:tr>
@@ -7341,8 +7706,18 @@
                 <w:sz w:val="24"/>
                 <w:szCs w:val="24"/>
               </w:rPr>
-              <w:t>Réduction des dépenses</w:t>
-            </w:r>
+              <w:t xml:space="preserve">Réduction des </w:t>
+            </w:r>
+            <w:proofErr w:type="spellStart"/>
+            <w:r>
+              <w:rPr>
+                <w:rFonts w:ascii="Garamond" w:eastAsia="Times New Roman" w:hAnsi="Garamond" w:cs="Calibri"/>
+                <w:sz w:val="24"/>
+                <w:szCs w:val="24"/>
+              </w:rPr>
+              <w:t>dépenses</w:t>
+            </w:r>
+            <w:proofErr w:type="spellEnd"/>
           </w:p>
         </w:tc>
         <w:tc>
@@ -7549,14 +7924,34 @@
                 <w:szCs w:val="24"/>
               </w:rPr>
             </w:pPr>
-            <w:r>
-              <w:rPr>
-                <w:rFonts w:ascii="Garamond" w:eastAsia="Times New Roman" w:hAnsi="Garamond" w:cs="Calibri"/>
-                <w:sz w:val="24"/>
-                <w:szCs w:val="24"/>
-              </w:rPr>
-              <w:t>Emprunts / crédits</w:t>
-            </w:r>
+            <w:proofErr w:type="spellStart"/>
+            <w:r>
+              <w:rPr>
+                <w:rFonts w:ascii="Garamond" w:eastAsia="Times New Roman" w:hAnsi="Garamond" w:cs="Calibri"/>
+                <w:sz w:val="24"/>
+                <w:szCs w:val="24"/>
+              </w:rPr>
+              <w:t>Emprunts</w:t>
+            </w:r>
+            <w:proofErr w:type="spellEnd"/>
+            <w:r>
+              <w:rPr>
+                <w:rFonts w:ascii="Garamond" w:eastAsia="Times New Roman" w:hAnsi="Garamond" w:cs="Calibri"/>
+                <w:sz w:val="24"/>
+                <w:szCs w:val="24"/>
+              </w:rPr>
+              <w:t xml:space="preserve"> / </w:t>
+            </w:r>
+            <w:proofErr w:type="spellStart"/>
+            <w:r>
+              <w:rPr>
+                <w:rFonts w:ascii="Garamond" w:eastAsia="Times New Roman" w:hAnsi="Garamond" w:cs="Calibri"/>
+                <w:sz w:val="24"/>
+                <w:szCs w:val="24"/>
+              </w:rPr>
+              <w:t>crédits</w:t>
+            </w:r>
+            <w:proofErr w:type="spellEnd"/>
           </w:p>
         </w:tc>
         <w:tc>
@@ -7655,6 +8050,7 @@
                 <w:szCs w:val="24"/>
               </w:rPr>
             </w:pPr>
+            <w:proofErr w:type="spellStart"/>
             <w:r>
               <w:rPr>
                 <w:rFonts w:ascii="Garamond" w:eastAsia="Times New Roman" w:hAnsi="Garamond" w:cs="Calibri"/>
@@ -7663,6 +8059,7 @@
               </w:rPr>
               <w:t>Désépargne</w:t>
             </w:r>
+            <w:proofErr w:type="spellEnd"/>
           </w:p>
         </w:tc>
         <w:tc>
@@ -7767,8 +8164,18 @@
                 <w:sz w:val="24"/>
                 <w:szCs w:val="24"/>
               </w:rPr>
-              <w:t>Réduction de la consommation</w:t>
-            </w:r>
+              <w:t xml:space="preserve">Réduction de la </w:t>
+            </w:r>
+            <w:proofErr w:type="spellStart"/>
+            <w:r>
+              <w:rPr>
+                <w:rFonts w:ascii="Garamond" w:eastAsia="Times New Roman" w:hAnsi="Garamond" w:cs="Calibri"/>
+                <w:sz w:val="24"/>
+                <w:szCs w:val="24"/>
+              </w:rPr>
+              <w:t>consommation</w:t>
+            </w:r>
+            <w:proofErr w:type="spellEnd"/>
           </w:p>
         </w:tc>
         <w:tc>
@@ -7975,14 +8382,34 @@
                 <w:szCs w:val="24"/>
               </w:rPr>
             </w:pPr>
-            <w:r>
-              <w:rPr>
-                <w:rFonts w:ascii="Garamond" w:eastAsia="Times New Roman" w:hAnsi="Garamond" w:cs="Calibri"/>
-                <w:sz w:val="24"/>
-                <w:szCs w:val="24"/>
-              </w:rPr>
-              <w:t>Autres à préciser</w:t>
-            </w:r>
+            <w:proofErr w:type="spellStart"/>
+            <w:r>
+              <w:rPr>
+                <w:rFonts w:ascii="Garamond" w:eastAsia="Times New Roman" w:hAnsi="Garamond" w:cs="Calibri"/>
+                <w:sz w:val="24"/>
+                <w:szCs w:val="24"/>
+              </w:rPr>
+              <w:t>Autres</w:t>
+            </w:r>
+            <w:proofErr w:type="spellEnd"/>
+            <w:r>
+              <w:rPr>
+                <w:rFonts w:ascii="Garamond" w:eastAsia="Times New Roman" w:hAnsi="Garamond" w:cs="Calibri"/>
+                <w:sz w:val="24"/>
+                <w:szCs w:val="24"/>
+              </w:rPr>
+              <w:t xml:space="preserve"> à </w:t>
+            </w:r>
+            <w:proofErr w:type="spellStart"/>
+            <w:r>
+              <w:rPr>
+                <w:rFonts w:ascii="Garamond" w:eastAsia="Times New Roman" w:hAnsi="Garamond" w:cs="Calibri"/>
+                <w:sz w:val="24"/>
+                <w:szCs w:val="24"/>
+              </w:rPr>
+              <w:t>préciser</w:t>
+            </w:r>
+            <w:proofErr w:type="spellEnd"/>
           </w:p>
         </w:tc>
         <w:tc>
@@ -8116,8 +8543,20 @@
                 <w:sz w:val="24"/>
                 <w:szCs w:val="24"/>
               </w:rPr>
-              <w:t>Situation financière actuelle</w:t>
-            </w:r>
+              <w:t xml:space="preserve">Situation financière </w:t>
+            </w:r>
+            <w:proofErr w:type="spellStart"/>
+            <w:r>
+              <w:rPr>
+                <w:rFonts w:ascii="Garamond" w:eastAsia="Times New Roman" w:hAnsi="Garamond" w:cs="Calibri"/>
+                <w:b/>
+                <w:bCs/>
+                <w:sz w:val="24"/>
+                <w:szCs w:val="24"/>
+              </w:rPr>
+              <w:t>actuelle</w:t>
+            </w:r>
+            <w:proofErr w:type="spellEnd"/>
           </w:p>
         </w:tc>
         <w:tc>
@@ -8146,6 +8585,7 @@
                 <w:szCs w:val="24"/>
               </w:rPr>
             </w:pPr>
+            <w:proofErr w:type="spellStart"/>
             <w:r>
               <w:rPr>
                 <w:rFonts w:ascii="Garamond" w:eastAsia="Times New Roman" w:hAnsi="Garamond" w:cs="Calibri"/>
@@ -8156,6 +8596,7 @@
               </w:rPr>
               <w:t>Effectif</w:t>
             </w:r>
+            <w:proofErr w:type="spellEnd"/>
           </w:p>
         </w:tc>
         <w:tc>
@@ -8184,6 +8625,7 @@
                 <w:szCs w:val="24"/>
               </w:rPr>
             </w:pPr>
+            <w:proofErr w:type="spellStart"/>
             <w:r>
               <w:rPr>
                 <w:rFonts w:ascii="Garamond" w:eastAsia="Times New Roman" w:hAnsi="Garamond" w:cs="Calibri"/>
@@ -8204,6 +8646,7 @@
               </w:rPr>
               <w:t>ourcentage</w:t>
             </w:r>
+            <w:proofErr w:type="spellEnd"/>
           </w:p>
         </w:tc>
       </w:tr>
@@ -8240,8 +8683,18 @@
                 <w:sz w:val="24"/>
                 <w:szCs w:val="24"/>
               </w:rPr>
-              <w:t>Nette amélioration</w:t>
-            </w:r>
+              <w:t xml:space="preserve">Nette </w:t>
+            </w:r>
+            <w:proofErr w:type="spellStart"/>
+            <w:r>
+              <w:rPr>
+                <w:rFonts w:ascii="Garamond" w:eastAsia="Times New Roman" w:hAnsi="Garamond" w:cs="Calibri"/>
+                <w:sz w:val="24"/>
+                <w:szCs w:val="24"/>
+              </w:rPr>
+              <w:t>amélioration</w:t>
+            </w:r>
+            <w:proofErr w:type="spellEnd"/>
           </w:p>
         </w:tc>
         <w:tc>
@@ -8336,14 +8789,34 @@
                 <w:szCs w:val="24"/>
               </w:rPr>
             </w:pPr>
-            <w:r>
-              <w:rPr>
-                <w:rFonts w:ascii="Garamond" w:eastAsia="Times New Roman" w:hAnsi="Garamond" w:cs="Calibri"/>
-                <w:sz w:val="24"/>
-                <w:szCs w:val="24"/>
-              </w:rPr>
-              <w:t>Légère amélioration</w:t>
-            </w:r>
+            <w:proofErr w:type="spellStart"/>
+            <w:r>
+              <w:rPr>
+                <w:rFonts w:ascii="Garamond" w:eastAsia="Times New Roman" w:hAnsi="Garamond" w:cs="Calibri"/>
+                <w:sz w:val="24"/>
+                <w:szCs w:val="24"/>
+              </w:rPr>
+              <w:t>Légère</w:t>
+            </w:r>
+            <w:proofErr w:type="spellEnd"/>
+            <w:r>
+              <w:rPr>
+                <w:rFonts w:ascii="Garamond" w:eastAsia="Times New Roman" w:hAnsi="Garamond" w:cs="Calibri"/>
+                <w:sz w:val="24"/>
+                <w:szCs w:val="24"/>
+              </w:rPr>
+              <w:t xml:space="preserve"> </w:t>
+            </w:r>
+            <w:proofErr w:type="spellStart"/>
+            <w:r>
+              <w:rPr>
+                <w:rFonts w:ascii="Garamond" w:eastAsia="Times New Roman" w:hAnsi="Garamond" w:cs="Calibri"/>
+                <w:sz w:val="24"/>
+                <w:szCs w:val="24"/>
+              </w:rPr>
+              <w:t>amélioration</w:t>
+            </w:r>
+            <w:proofErr w:type="spellEnd"/>
           </w:p>
         </w:tc>
         <w:tc>
@@ -8438,14 +8911,34 @@
                 <w:szCs w:val="24"/>
               </w:rPr>
             </w:pPr>
-            <w:r>
-              <w:rPr>
-                <w:rFonts w:ascii="Garamond" w:eastAsia="Times New Roman" w:hAnsi="Garamond" w:cs="Calibri"/>
-                <w:sz w:val="24"/>
-                <w:szCs w:val="24"/>
-              </w:rPr>
-              <w:t>Reste inchangée</w:t>
-            </w:r>
+            <w:proofErr w:type="spellStart"/>
+            <w:r>
+              <w:rPr>
+                <w:rFonts w:ascii="Garamond" w:eastAsia="Times New Roman" w:hAnsi="Garamond" w:cs="Calibri"/>
+                <w:sz w:val="24"/>
+                <w:szCs w:val="24"/>
+              </w:rPr>
+              <w:t>Reste</w:t>
+            </w:r>
+            <w:proofErr w:type="spellEnd"/>
+            <w:r>
+              <w:rPr>
+                <w:rFonts w:ascii="Garamond" w:eastAsia="Times New Roman" w:hAnsi="Garamond" w:cs="Calibri"/>
+                <w:sz w:val="24"/>
+                <w:szCs w:val="24"/>
+              </w:rPr>
+              <w:t xml:space="preserve"> </w:t>
+            </w:r>
+            <w:proofErr w:type="spellStart"/>
+            <w:r>
+              <w:rPr>
+                <w:rFonts w:ascii="Garamond" w:eastAsia="Times New Roman" w:hAnsi="Garamond" w:cs="Calibri"/>
+                <w:sz w:val="24"/>
+                <w:szCs w:val="24"/>
+              </w:rPr>
+              <w:t>inchangée</w:t>
+            </w:r>
+            <w:proofErr w:type="spellEnd"/>
           </w:p>
         </w:tc>
         <w:tc>
@@ -8540,14 +9033,34 @@
                 <w:szCs w:val="24"/>
               </w:rPr>
             </w:pPr>
-            <w:r>
-              <w:rPr>
-                <w:rFonts w:ascii="Garamond" w:eastAsia="Times New Roman" w:hAnsi="Garamond" w:cs="Calibri"/>
-                <w:sz w:val="24"/>
-                <w:szCs w:val="24"/>
-              </w:rPr>
-              <w:t>Légère dégradation</w:t>
-            </w:r>
+            <w:proofErr w:type="spellStart"/>
+            <w:r>
+              <w:rPr>
+                <w:rFonts w:ascii="Garamond" w:eastAsia="Times New Roman" w:hAnsi="Garamond" w:cs="Calibri"/>
+                <w:sz w:val="24"/>
+                <w:szCs w:val="24"/>
+              </w:rPr>
+              <w:t>Légère</w:t>
+            </w:r>
+            <w:proofErr w:type="spellEnd"/>
+            <w:r>
+              <w:rPr>
+                <w:rFonts w:ascii="Garamond" w:eastAsia="Times New Roman" w:hAnsi="Garamond" w:cs="Calibri"/>
+                <w:sz w:val="24"/>
+                <w:szCs w:val="24"/>
+              </w:rPr>
+              <w:t xml:space="preserve"> </w:t>
+            </w:r>
+            <w:proofErr w:type="spellStart"/>
+            <w:r>
+              <w:rPr>
+                <w:rFonts w:ascii="Garamond" w:eastAsia="Times New Roman" w:hAnsi="Garamond" w:cs="Calibri"/>
+                <w:sz w:val="24"/>
+                <w:szCs w:val="24"/>
+              </w:rPr>
+              <w:t>dégradation</w:t>
+            </w:r>
+            <w:proofErr w:type="spellEnd"/>
           </w:p>
         </w:tc>
         <w:tc>
@@ -8648,8 +9161,18 @@
                 <w:sz w:val="24"/>
                 <w:szCs w:val="24"/>
               </w:rPr>
-              <w:t>Nette dégradation</w:t>
-            </w:r>
+              <w:t xml:space="preserve">Nette </w:t>
+            </w:r>
+            <w:proofErr w:type="spellStart"/>
+            <w:r>
+              <w:rPr>
+                <w:rFonts w:ascii="Garamond" w:eastAsia="Times New Roman" w:hAnsi="Garamond" w:cs="Calibri"/>
+                <w:sz w:val="24"/>
+                <w:szCs w:val="24"/>
+              </w:rPr>
+              <w:t>dégradation</w:t>
+            </w:r>
+            <w:proofErr w:type="spellEnd"/>
           </w:p>
         </w:tc>
         <w:tc>
@@ -9195,8 +9718,20 @@
                 <w:sz w:val="24"/>
                 <w:szCs w:val="24"/>
               </w:rPr>
-              <w:t>Situation financière actuelle</w:t>
-            </w:r>
+              <w:t xml:space="preserve">Situation financière </w:t>
+            </w:r>
+            <w:proofErr w:type="spellStart"/>
+            <w:r>
+              <w:rPr>
+                <w:rFonts w:ascii="Garamond" w:eastAsia="Times New Roman" w:hAnsi="Garamond" w:cs="Calibri"/>
+                <w:b/>
+                <w:bCs/>
+                <w:sz w:val="24"/>
+                <w:szCs w:val="24"/>
+              </w:rPr>
+              <w:t>actuelle</w:t>
+            </w:r>
+            <w:proofErr w:type="spellEnd"/>
           </w:p>
         </w:tc>
         <w:tc>
@@ -9225,6 +9760,7 @@
                 <w:szCs w:val="24"/>
               </w:rPr>
             </w:pPr>
+            <w:proofErr w:type="spellStart"/>
             <w:r>
               <w:rPr>
                 <w:rFonts w:ascii="Garamond" w:eastAsia="Times New Roman" w:hAnsi="Garamond" w:cs="Calibri"/>
@@ -9235,6 +9771,7 @@
               </w:rPr>
               <w:t>Effectif</w:t>
             </w:r>
+            <w:proofErr w:type="spellEnd"/>
           </w:p>
         </w:tc>
         <w:tc>
@@ -9263,6 +9800,7 @@
                 <w:szCs w:val="24"/>
               </w:rPr>
             </w:pPr>
+            <w:proofErr w:type="spellStart"/>
             <w:r>
               <w:rPr>
                 <w:rFonts w:ascii="Garamond" w:eastAsia="Times New Roman" w:hAnsi="Garamond" w:cs="Calibri"/>
@@ -9273,6 +9811,7 @@
               </w:rPr>
               <w:t>Pourcentage</w:t>
             </w:r>
+            <w:proofErr w:type="spellEnd"/>
           </w:p>
         </w:tc>
       </w:tr>
@@ -9309,8 +9848,18 @@
                 <w:sz w:val="24"/>
                 <w:szCs w:val="24"/>
               </w:rPr>
-              <w:t>Nette amélioration</w:t>
-            </w:r>
+              <w:t xml:space="preserve">Nette </w:t>
+            </w:r>
+            <w:proofErr w:type="spellStart"/>
+            <w:r>
+              <w:rPr>
+                <w:rFonts w:ascii="Garamond" w:eastAsia="Times New Roman" w:hAnsi="Garamond" w:cs="Calibri"/>
+                <w:sz w:val="24"/>
+                <w:szCs w:val="24"/>
+              </w:rPr>
+              <w:t>amélioration</w:t>
+            </w:r>
+            <w:proofErr w:type="spellEnd"/>
           </w:p>
         </w:tc>
         <w:tc>
@@ -9409,14 +9958,34 @@
                 <w:szCs w:val="24"/>
               </w:rPr>
             </w:pPr>
-            <w:r>
-              <w:rPr>
-                <w:rFonts w:ascii="Garamond" w:eastAsia="Times New Roman" w:hAnsi="Garamond" w:cs="Calibri"/>
-                <w:sz w:val="24"/>
-                <w:szCs w:val="24"/>
-              </w:rPr>
-              <w:t>Légère amélioration</w:t>
-            </w:r>
+            <w:proofErr w:type="spellStart"/>
+            <w:r>
+              <w:rPr>
+                <w:rFonts w:ascii="Garamond" w:eastAsia="Times New Roman" w:hAnsi="Garamond" w:cs="Calibri"/>
+                <w:sz w:val="24"/>
+                <w:szCs w:val="24"/>
+              </w:rPr>
+              <w:t>Légère</w:t>
+            </w:r>
+            <w:proofErr w:type="spellEnd"/>
+            <w:r>
+              <w:rPr>
+                <w:rFonts w:ascii="Garamond" w:eastAsia="Times New Roman" w:hAnsi="Garamond" w:cs="Calibri"/>
+                <w:sz w:val="24"/>
+                <w:szCs w:val="24"/>
+              </w:rPr>
+              <w:t xml:space="preserve"> </w:t>
+            </w:r>
+            <w:proofErr w:type="spellStart"/>
+            <w:r>
+              <w:rPr>
+                <w:rFonts w:ascii="Garamond" w:eastAsia="Times New Roman" w:hAnsi="Garamond" w:cs="Calibri"/>
+                <w:sz w:val="24"/>
+                <w:szCs w:val="24"/>
+              </w:rPr>
+              <w:t>amélioration</w:t>
+            </w:r>
+            <w:proofErr w:type="spellEnd"/>
           </w:p>
         </w:tc>
         <w:tc>
@@ -9515,14 +10084,34 @@
                 <w:szCs w:val="24"/>
               </w:rPr>
             </w:pPr>
-            <w:r>
-              <w:rPr>
-                <w:rFonts w:ascii="Garamond" w:eastAsia="Times New Roman" w:hAnsi="Garamond" w:cs="Calibri"/>
-                <w:sz w:val="24"/>
-                <w:szCs w:val="24"/>
-              </w:rPr>
-              <w:t>Reste inchangée</w:t>
-            </w:r>
+            <w:proofErr w:type="spellStart"/>
+            <w:r>
+              <w:rPr>
+                <w:rFonts w:ascii="Garamond" w:eastAsia="Times New Roman" w:hAnsi="Garamond" w:cs="Calibri"/>
+                <w:sz w:val="24"/>
+                <w:szCs w:val="24"/>
+              </w:rPr>
+              <w:t>Reste</w:t>
+            </w:r>
+            <w:proofErr w:type="spellEnd"/>
+            <w:r>
+              <w:rPr>
+                <w:rFonts w:ascii="Garamond" w:eastAsia="Times New Roman" w:hAnsi="Garamond" w:cs="Calibri"/>
+                <w:sz w:val="24"/>
+                <w:szCs w:val="24"/>
+              </w:rPr>
+              <w:t xml:space="preserve"> </w:t>
+            </w:r>
+            <w:proofErr w:type="spellStart"/>
+            <w:r>
+              <w:rPr>
+                <w:rFonts w:ascii="Garamond" w:eastAsia="Times New Roman" w:hAnsi="Garamond" w:cs="Calibri"/>
+                <w:sz w:val="24"/>
+                <w:szCs w:val="24"/>
+              </w:rPr>
+              <w:t>inchangée</w:t>
+            </w:r>
+            <w:proofErr w:type="spellEnd"/>
           </w:p>
         </w:tc>
         <w:tc>
@@ -9621,14 +10210,34 @@
                 <w:szCs w:val="24"/>
               </w:rPr>
             </w:pPr>
-            <w:r>
-              <w:rPr>
-                <w:rFonts w:ascii="Garamond" w:eastAsia="Times New Roman" w:hAnsi="Garamond" w:cs="Calibri"/>
-                <w:sz w:val="24"/>
-                <w:szCs w:val="24"/>
-              </w:rPr>
-              <w:t>Légère dégradation</w:t>
-            </w:r>
+            <w:proofErr w:type="spellStart"/>
+            <w:r>
+              <w:rPr>
+                <w:rFonts w:ascii="Garamond" w:eastAsia="Times New Roman" w:hAnsi="Garamond" w:cs="Calibri"/>
+                <w:sz w:val="24"/>
+                <w:szCs w:val="24"/>
+              </w:rPr>
+              <w:t>Légère</w:t>
+            </w:r>
+            <w:proofErr w:type="spellEnd"/>
+            <w:r>
+              <w:rPr>
+                <w:rFonts w:ascii="Garamond" w:eastAsia="Times New Roman" w:hAnsi="Garamond" w:cs="Calibri"/>
+                <w:sz w:val="24"/>
+                <w:szCs w:val="24"/>
+              </w:rPr>
+              <w:t xml:space="preserve"> </w:t>
+            </w:r>
+            <w:proofErr w:type="spellStart"/>
+            <w:r>
+              <w:rPr>
+                <w:rFonts w:ascii="Garamond" w:eastAsia="Times New Roman" w:hAnsi="Garamond" w:cs="Calibri"/>
+                <w:sz w:val="24"/>
+                <w:szCs w:val="24"/>
+              </w:rPr>
+              <w:t>dégradation</w:t>
+            </w:r>
+            <w:proofErr w:type="spellEnd"/>
           </w:p>
         </w:tc>
         <w:tc>
@@ -9733,8 +10342,18 @@
                 <w:sz w:val="24"/>
                 <w:szCs w:val="24"/>
               </w:rPr>
-              <w:t>Nette dégradation</w:t>
-            </w:r>
+              <w:t xml:space="preserve">Nette </w:t>
+            </w:r>
+            <w:proofErr w:type="spellStart"/>
+            <w:r>
+              <w:rPr>
+                <w:rFonts w:ascii="Garamond" w:eastAsia="Times New Roman" w:hAnsi="Garamond" w:cs="Calibri"/>
+                <w:sz w:val="24"/>
+                <w:szCs w:val="24"/>
+              </w:rPr>
+              <w:t>dégradation</w:t>
+            </w:r>
+            <w:proofErr w:type="spellEnd"/>
           </w:p>
         </w:tc>
         <w:tc>
@@ -10178,6 +10797,7 @@
                 <w:szCs w:val="24"/>
               </w:rPr>
             </w:pPr>
+            <w:proofErr w:type="spellStart"/>
             <w:r>
               <w:rPr>
                 <w:rFonts w:ascii="Garamond" w:eastAsia="Times New Roman" w:hAnsi="Garamond" w:cs="Calibri"/>
@@ -10188,6 +10808,7 @@
               </w:rPr>
               <w:t>Effectif</w:t>
             </w:r>
+            <w:proofErr w:type="spellEnd"/>
           </w:p>
         </w:tc>
         <w:tc>
@@ -10216,6 +10837,7 @@
                 <w:szCs w:val="24"/>
               </w:rPr>
             </w:pPr>
+            <w:proofErr w:type="spellStart"/>
             <w:r>
               <w:rPr>
                 <w:rFonts w:ascii="Garamond" w:eastAsia="Times New Roman" w:hAnsi="Garamond" w:cs="Calibri"/>
@@ -10236,6 +10858,7 @@
               </w:rPr>
               <w:t>ourcentage</w:t>
             </w:r>
+            <w:proofErr w:type="spellEnd"/>
           </w:p>
         </w:tc>
       </w:tr>
@@ -10808,26 +11431,8 @@
 </w:document>
 </file>
 
-<file path=word/commentsExtensible.xml><?xml version="1.0" encoding="utf-8"?>
-<w16cex:commentsExtensible xmlns:wpc="http://schemas.microsoft.com/office/word/2010/wordprocessingCanvas" xmlns:cx="http://schemas.microsoft.com/office/drawing/2014/chartex" xmlns:cx1="http://schemas.microsoft.com/office/drawing/2015/9/8/chartex" xmlns:cx2="http://schemas.microsoft.com/office/drawing/2015/10/21/chartex" xmlns:cx3="http://schemas.microsoft.com/office/drawing/2016/5/9/chartex" xmlns:cx4="http://schemas.microsoft.com/office/drawing/2016/5/10/chartex" xmlns:cx5="http://schemas.microsoft.com/office/drawing/2016/5/11/chartex" xmlns:cx6="http://schemas.microsoft.com/office/drawing/2016/5/12/chartex" xmlns:cx7="http://schemas.microsoft.com/office/drawing/2016/5/13/chartex" xmlns:cx8="http://schemas.microsoft.com/office/drawing/2016/5/14/chartex" xmlns:cr="http://schemas.microsoft.com/office/comments/2020/reactions" xmlns:mc="http://schemas.openxmlformats.org/markup-compatibility/2006" xmlns:aink="http://schemas.microsoft.com/office/drawing/2016/ink" xmlns:am3d="http://schemas.microsoft.com/office/drawing/2017/model3d" xmlns:o="urn:schemas-microsoft-com:office:office" xmlns:oel="http://schemas.microsoft.com/office/2019/extlst" xmlns:r="http://schemas.openxmlformats.org/officeDocument/2006/relationships" xmlns:m="http://schemas.openxmlformats.org/officeDocument/2006/math" xmlns:v="urn:schemas-microsoft-com:vml" xmlns:wp14="http://schemas.microsoft.com/office/word/2010/wordprocessingDrawing" xmlns:wp="http://schemas.openxmlformats.org/drawingml/2006/wordprocessingDrawing" xmlns:w10="urn:schemas-microsoft-com:office:word" xmlns:w="http://schemas.openxmlformats.org/wordprocessingml/2006/main" xmlns:w14="http://schemas.microsoft.com/office/word/2010/wordml" xmlns:w15="http://schemas.microsoft.com/office/word/2012/wordml" xmlns:w16cex="http://schemas.microsoft.com/office/word/2018/wordml/cex" xmlns:w16cid="http://schemas.microsoft.com/office/word/2016/wordml/cid" xmlns:w16="http://schemas.microsoft.com/office/word/2018/wordml" xmlns:w16du="http://schemas.microsoft.com/office/word/2023/wordml/word16du" xmlns:w16sdtdh="http://schemas.microsoft.com/office/word/2020/wordml/sdtdatahash" xmlns:w16se="http://schemas.microsoft.com/office/word/2015/wordml/symex" xmlns:wpg="http://schemas.microsoft.com/office/word/2010/wordprocessingGroup" xmlns:wpi="http://schemas.microsoft.com/office/word/2010/wordprocessingInk" xmlns:wne="http://schemas.microsoft.com/office/word/2006/wordml" xmlns:wps="http://schemas.microsoft.com/office/word/2010/wordprocessingShape" mc:Ignorable="w14 w15 w16se w16cid w16 w16cex w16sdtdh cr w16du wp14">
-  <w16cex:commentExtensible w16cex:durableId="4E1A7FAE" w16cex:dateUtc="2024-12-07T15:34:00Z"/>
-  <w16cex:commentExtensible w16cex:durableId="571D730A" w16cex:dateUtc="2024-12-07T16:52:00Z"/>
-  <w16cex:commentExtensible w16cex:durableId="2096FC44" w16cex:dateUtc="2024-12-07T17:10:00Z"/>
-  <w16cex:commentExtensible w16cex:durableId="618EC7B4" w16cex:dateUtc="2024-12-07T17:07:00Z"/>
-</w16cex:commentsExtensible>
-</file>
-
-<file path=word/commentsIds.xml><?xml version="1.0" encoding="utf-8"?>
-<w16cid:commentsIds xmlns:wpc="http://schemas.microsoft.com/office/word/2010/wordprocessingCanvas" xmlns:cx="http://schemas.microsoft.com/office/drawing/2014/chartex" xmlns:cx1="http://schemas.microsoft.com/office/drawing/2015/9/8/chartex" xmlns:cx2="http://schemas.microsoft.com/office/drawing/2015/10/21/chartex" xmlns:cx3="http://schemas.microsoft.com/office/drawing/2016/5/9/chartex" xmlns:cx4="http://schemas.microsoft.com/office/drawing/2016/5/10/chartex" xmlns:cx5="http://schemas.microsoft.com/office/drawing/2016/5/11/chartex" xmlns:cx6="http://schemas.microsoft.com/office/drawing/2016/5/12/chartex" xmlns:cx7="http://schemas.microsoft.com/office/drawing/2016/5/13/chartex" xmlns:cx8="http://schemas.microsoft.com/office/drawing/2016/5/14/chartex" xmlns:mc="http://schemas.openxmlformats.org/markup-compatibility/2006" xmlns:aink="http://schemas.microsoft.com/office/drawing/2016/ink" xmlns:am3d="http://schemas.microsoft.com/office/drawing/2017/model3d" xmlns:o="urn:schemas-microsoft-com:office:office" xmlns:oel="http://schemas.microsoft.com/office/2019/extlst" xmlns:r="http://schemas.openxmlformats.org/officeDocument/2006/relationships" xmlns:m="http://schemas.openxmlformats.org/officeDocument/2006/math" xmlns:v="urn:schemas-microsoft-com:vml" xmlns:wp14="http://schemas.microsoft.com/office/word/2010/wordprocessingDrawing" xmlns:wp="http://schemas.openxmlformats.org/drawingml/2006/wordprocessingDrawing" xmlns:w10="urn:schemas-microsoft-com:office:word" xmlns:w="http://schemas.openxmlformats.org/wordprocessingml/2006/main" xmlns:w14="http://schemas.microsoft.com/office/word/2010/wordml" xmlns:w15="http://schemas.microsoft.com/office/word/2012/wordml" xmlns:w16cex="http://schemas.microsoft.com/office/word/2018/wordml/cex" xmlns:w16cid="http://schemas.microsoft.com/office/word/2016/wordml/cid" xmlns:w16="http://schemas.microsoft.com/office/word/2018/wordml" xmlns:w16du="http://schemas.microsoft.com/office/word/2023/wordml/word16du" xmlns:w16sdtdh="http://schemas.microsoft.com/office/word/2020/wordml/sdtdatahash" xmlns:w16se="http://schemas.microsoft.com/office/word/2015/wordml/symex" xmlns:wpg="http://schemas.microsoft.com/office/word/2010/wordprocessingGroup" xmlns:wpi="http://schemas.microsoft.com/office/word/2010/wordprocessingInk" xmlns:wne="http://schemas.microsoft.com/office/word/2006/wordml" xmlns:wps="http://schemas.microsoft.com/office/word/2010/wordprocessingShape" mc:Ignorable="w14 w15 w16se w16cid w16 w16cex w16sdtdh w16du wp14">
-  <w16cid:commentId w16cid:paraId="08CF5840" w16cid:durableId="4E1A7FAE"/>
-  <w16cid:commentId w16cid:paraId="2124DEFD" w16cid:durableId="571D730A"/>
-  <w16cid:commentId w16cid:paraId="3ECA0681" w16cid:durableId="2096FC44"/>
-  <w16cid:commentId w16cid:paraId="6EA3C440" w16cid:durableId="618EC7B4"/>
-</w16cid:commentsIds>
-</file>
-
 <file path=word/numbering.xml><?xml version="1.0" encoding="utf-8"?>
-<w:numbering xmlns:wpc="http://schemas.microsoft.com/office/word/2010/wordprocessingCanvas" xmlns:cx="http://schemas.microsoft.com/office/drawing/2014/chartex" xmlns:mc="http://schemas.openxmlformats.org/markup-compatibility/2006" xmlns:o="urn:schemas-microsoft-com:office:office" xmlns:r="http://schemas.openxmlformats.org/officeDocument/2006/relationships" xmlns:m="http://schemas.openxmlformats.org/officeDocument/2006/math" xmlns:v="urn:schemas-microsoft-com:vml" xmlns:wp14="http://schemas.microsoft.com/office/word/2010/wordprocessingDrawing" xmlns:wp="http://schemas.openxmlformats.org/drawingml/2006/wordprocessingDrawing" xmlns:w10="urn:schemas-microsoft-com:office:word" xmlns:w="http://schemas.openxmlformats.org/wordprocessingml/2006/main" xmlns:w14="http://schemas.microsoft.com/office/word/2010/wordml" xmlns:w15="http://schemas.microsoft.com/office/word/2012/wordml" xmlns:w16se="http://schemas.microsoft.com/office/word/2015/wordml/symex" xmlns:wpg="http://schemas.microsoft.com/office/word/2010/wordprocessingGroup" xmlns:wpi="http://schemas.microsoft.com/office/word/2010/wordprocessingInk" xmlns:wne="http://schemas.microsoft.com/office/word/2006/wordml" xmlns:wps="http://schemas.microsoft.com/office/word/2010/wordprocessingShape" mc:Ignorable="w14 w15 w16se wp14">
+<w:numbering xmlns:wpc="http://schemas.microsoft.com/office/word/2010/wordprocessingCanvas" xmlns:cx="http://schemas.microsoft.com/office/drawing/2014/chartex" xmlns:cx1="http://schemas.microsoft.com/office/drawing/2015/9/8/chartex" xmlns:cx2="http://schemas.microsoft.com/office/drawing/2015/10/21/chartex" xmlns:cx3="http://schemas.microsoft.com/office/drawing/2016/5/9/chartex" xmlns:cx4="http://schemas.microsoft.com/office/drawing/2016/5/10/chartex" xmlns:cx5="http://schemas.microsoft.com/office/drawing/2016/5/11/chartex" xmlns:cx6="http://schemas.microsoft.com/office/drawing/2016/5/12/chartex" xmlns:cx7="http://schemas.microsoft.com/office/drawing/2016/5/13/chartex" xmlns:cx8="http://schemas.microsoft.com/office/drawing/2016/5/14/chartex" xmlns:mc="http://schemas.openxmlformats.org/markup-compatibility/2006" xmlns:aink="http://schemas.microsoft.com/office/drawing/2016/ink" xmlns:am3d="http://schemas.microsoft.com/office/drawing/2017/model3d" xmlns:o="urn:schemas-microsoft-com:office:office" xmlns:oel="http://schemas.microsoft.com/office/2019/extlst" xmlns:r="http://schemas.openxmlformats.org/officeDocument/2006/relationships" xmlns:m="http://schemas.openxmlformats.org/officeDocument/2006/math" xmlns:v="urn:schemas-microsoft-com:vml" xmlns:wp14="http://schemas.microsoft.com/office/word/2010/wordprocessingDrawing" xmlns:wp="http://schemas.openxmlformats.org/drawingml/2006/wordprocessingDrawing" xmlns:w10="urn:schemas-microsoft-com:office:word" xmlns:w="http://schemas.openxmlformats.org/wordprocessingml/2006/main" xmlns:w14="http://schemas.microsoft.com/office/word/2010/wordml" xmlns:w15="http://schemas.microsoft.com/office/word/2012/wordml" xmlns:w16cex="http://schemas.microsoft.com/office/word/2018/wordml/cex" xmlns:w16cid="http://schemas.microsoft.com/office/word/2016/wordml/cid" xmlns:w16="http://schemas.microsoft.com/office/word/2018/wordml" xmlns:w16du="http://schemas.microsoft.com/office/word/2023/wordml/word16du" xmlns:w16sdtdh="http://schemas.microsoft.com/office/word/2020/wordml/sdtdatahash" xmlns:w16sdtfl="http://schemas.microsoft.com/office/word/2024/wordml/sdtformatlock" xmlns:w16se="http://schemas.microsoft.com/office/word/2015/wordml/symex" xmlns:wpg="http://schemas.microsoft.com/office/word/2010/wordprocessingGroup" xmlns:wpi="http://schemas.microsoft.com/office/word/2010/wordprocessingInk" xmlns:wne="http://schemas.microsoft.com/office/word/2006/wordml" xmlns:wps="http://schemas.microsoft.com/office/word/2010/wordprocessingShape" mc:Ignorable="w14 w15 w16se w16cid w16 w16cex w16sdtdh w16sdtfl w16du wp14">
   <w:abstractNum w:abstractNumId="0" w15:restartNumberingAfterBreak="0">
     <w:nsid w:val="02B20BAB"/>
     <w:multiLevelType w:val="hybridMultilevel"/>
@@ -11808,38 +12413,38 @@
       </w:pPr>
     </w:lvl>
   </w:abstractNum>
-  <w:num w:numId="1">
+  <w:num w:numId="1" w16cid:durableId="1593972346">
     <w:abstractNumId w:val="5"/>
   </w:num>
-  <w:num w:numId="2">
+  <w:num w:numId="2" w16cid:durableId="1797678077">
     <w:abstractNumId w:val="6"/>
   </w:num>
-  <w:num w:numId="3">
+  <w:num w:numId="3" w16cid:durableId="728723524">
     <w:abstractNumId w:val="8"/>
   </w:num>
-  <w:num w:numId="4">
+  <w:num w:numId="4" w16cid:durableId="453602528">
     <w:abstractNumId w:val="2"/>
   </w:num>
-  <w:num w:numId="5">
+  <w:num w:numId="5" w16cid:durableId="756946918">
     <w:abstractNumId w:val="4"/>
   </w:num>
-  <w:num w:numId="6">
+  <w:num w:numId="6" w16cid:durableId="1754929913">
     <w:abstractNumId w:val="3"/>
   </w:num>
-  <w:num w:numId="7">
+  <w:num w:numId="7" w16cid:durableId="939947975">
     <w:abstractNumId w:val="0"/>
   </w:num>
-  <w:num w:numId="8">
+  <w:num w:numId="8" w16cid:durableId="360936070">
     <w:abstractNumId w:val="1"/>
   </w:num>
-  <w:num w:numId="9">
+  <w:num w:numId="9" w16cid:durableId="121074111">
     <w:abstractNumId w:val="7"/>
   </w:num>
 </w:numbering>
 </file>
 
 <file path=word/styles.xml><?xml version="1.0" encoding="utf-8"?>
-<w:styles xmlns:mc="http://schemas.openxmlformats.org/markup-compatibility/2006" xmlns:r="http://schemas.openxmlformats.org/officeDocument/2006/relationships" xmlns:w="http://schemas.openxmlformats.org/wordprocessingml/2006/main" xmlns:w14="http://schemas.microsoft.com/office/word/2010/wordml" xmlns:w15="http://schemas.microsoft.com/office/word/2012/wordml" xmlns:w16se="http://schemas.microsoft.com/office/word/2015/wordml/symex" mc:Ignorable="w14 w15 w16se">
+<w:styles xmlns:mc="http://schemas.openxmlformats.org/markup-compatibility/2006" xmlns:r="http://schemas.openxmlformats.org/officeDocument/2006/relationships" xmlns:w="http://schemas.openxmlformats.org/wordprocessingml/2006/main" xmlns:w14="http://schemas.microsoft.com/office/word/2010/wordml" xmlns:w15="http://schemas.microsoft.com/office/word/2012/wordml" xmlns:w16cex="http://schemas.microsoft.com/office/word/2018/wordml/cex" xmlns:w16cid="http://schemas.microsoft.com/office/word/2016/wordml/cid" xmlns:w16="http://schemas.microsoft.com/office/word/2018/wordml" xmlns:w16du="http://schemas.microsoft.com/office/word/2023/wordml/word16du" xmlns:w16sdtdh="http://schemas.microsoft.com/office/word/2020/wordml/sdtdatahash" xmlns:w16sdtfl="http://schemas.microsoft.com/office/word/2024/wordml/sdtformatlock" xmlns:w16se="http://schemas.microsoft.com/office/word/2015/wordml/symex" mc:Ignorable="w14 w15 w16se w16cid w16 w16cex w16sdtdh w16sdtfl w16du">
   <w:docDefaults>
     <w:rPrDefault>
       <w:rPr>
@@ -11855,7 +12460,7 @@
       </w:pPr>
     </w:pPrDefault>
   </w:docDefaults>
-  <w:latentStyles w:defLockedState="0" w:defUIPriority="99" w:defSemiHidden="0" w:defUnhideWhenUsed="0" w:defQFormat="0" w:count="371">
+  <w:latentStyles w:defLockedState="0" w:defUIPriority="99" w:defSemiHidden="0" w:defUnhideWhenUsed="0" w:defQFormat="0" w:count="376">
     <w:lsdException w:name="Normal" w:uiPriority="0" w:qFormat="1"/>
     <w:lsdException w:name="heading 1" w:uiPriority="9" w:qFormat="1"/>
     <w:lsdException w:name="heading 2" w:semiHidden="1" w:uiPriority="9" w:unhideWhenUsed="1" w:qFormat="1"/>
@@ -12227,6 +12832,11 @@
     <w:lsdException w:name="List Table 5 Dark Accent 6" w:uiPriority="50"/>
     <w:lsdException w:name="List Table 6 Colorful Accent 6" w:uiPriority="51"/>
     <w:lsdException w:name="List Table 7 Colorful Accent 6" w:uiPriority="52"/>
+    <w:lsdException w:name="Mention" w:semiHidden="1" w:unhideWhenUsed="1"/>
+    <w:lsdException w:name="Smart Hyperlink" w:semiHidden="1" w:unhideWhenUsed="1"/>
+    <w:lsdException w:name="Hashtag" w:semiHidden="1" w:unhideWhenUsed="1"/>
+    <w:lsdException w:name="Unresolved Mention" w:semiHidden="1" w:unhideWhenUsed="1"/>
+    <w:lsdException w:name="Smart Link" w:semiHidden="1" w:unhideWhenUsed="1"/>
   </w:latentStyles>
   <w:style w:type="paragraph" w:default="1" w:styleId="Normal">
     <w:name w:val="Normal"/>

</xml_diff>